<commit_message>
Fix: Durchgängiger schwarzer Rahmen im Header der BSW-Templates
Der Kopfbereich der Checkliste- und Bericht-Vorlage für Brandsicherheitswachen
hatte einen unvollständigen Rahmen (fehlende obere/linke/rechte Umrandung),
wodurch die Trennlinien wie freistehende Striche statt ein geschlossener
Kasten wirkten.

Co-Authored-By: Claude Sonnet 5 <noreply@anthropic.com>
</commit_message>
<xml_diff>
--- a/feuerwehr-management/data/Templates/BerichtBrandsicherheitswacheLB12.docx
+++ b/feuerwehr-management/data/Templates/BerichtBrandsicherheitswacheLB12.docx
@@ -20,7 +20,7 @@
     <w:tbl>
       <w:tblPr>
         <w:tblStyle w:val="TableGrid"/>
-        <w:tblW w:w="9638" w:type="dxa"/>
+        <w:tblW w:w="9795" w:type="dxa"/>
         <w:jc w:val="start"/>
         <w:tblInd w:w="0" w:type="dxa"/>
         <w:tblLayout w:type="fixed"/>
@@ -34,7 +34,7 @@
       </w:tblPr>
       <w:tblGrid>
         <w:gridCol w:w="3402"/>
-        <w:gridCol w:w="6236"/>
+        <w:gridCol w:w="6393"/>
       </w:tblGrid>
       <w:tr>
         <w:trPr/>
@@ -47,6 +47,7 @@
             <w:pPr>
               <w:pStyle w:val="Normal"/>
               <w:widowControl/>
+              <w:suppressAutoHyphens w:val="true"/>
               <w:spacing w:lineRule="auto" w:line="240" w:before="0" w:after="0"/>
               <w:jc w:val="start"/>
               <w:rPr>
@@ -70,13 +71,14 @@
         </w:tc>
         <w:tc>
           <w:tcPr>
-            <w:tcW w:w="6236" w:type="dxa"/>
+            <w:tcW w:w="6393" w:type="dxa"/>
             <w:tcBorders/>
           </w:tcPr>
           <w:p>
             <w:pPr>
               <w:pStyle w:val="Normal"/>
               <w:widowControl/>
+              <w:suppressAutoHyphens w:val="true"/>
               <w:spacing w:lineRule="auto" w:line="240" w:before="0" w:after="0"/>
               <w:jc w:val="start"/>
               <w:rPr>
@@ -87,14 +89,7 @@
               </w:rPr>
             </w:pPr>
             <w:r>
-              <w:rPr>
-                <w:rFonts w:eastAsia="ＭＳ 明朝" w:cs=""/>
-                <w:kern w:val="0"/>
-                <w:szCs w:val="22"/>
-                <w:lang w:val="en-US" w:eastAsia="en-US" w:bidi="ar-SA"/>
-              </w:rPr>
-            </w:r>
-            <w:r>
+              <w:rPr/>
               <w:t>{veranstaltungsort}</w:t>
             </w:r>
           </w:p>
@@ -102,6 +97,7 @@
             <w:pPr>
               <w:pStyle w:val="Normal"/>
               <w:widowControl/>
+              <w:suppressAutoHyphens w:val="true"/>
               <w:spacing w:lineRule="auto" w:line="240" w:before="0" w:after="0"/>
               <w:jc w:val="start"/>
               <w:rPr>
@@ -133,6 +129,7 @@
             <w:pPr>
               <w:pStyle w:val="Normal"/>
               <w:widowControl/>
+              <w:suppressAutoHyphens w:val="true"/>
               <w:spacing w:lineRule="auto" w:line="240" w:before="0" w:after="0"/>
               <w:jc w:val="start"/>
               <w:rPr>
@@ -156,13 +153,14 @@
         </w:tc>
         <w:tc>
           <w:tcPr>
-            <w:tcW w:w="6236" w:type="dxa"/>
+            <w:tcW w:w="6393" w:type="dxa"/>
             <w:tcBorders/>
           </w:tcPr>
           <w:p>
             <w:pPr>
               <w:pStyle w:val="Normal"/>
               <w:widowControl/>
+              <w:suppressAutoHyphens w:val="true"/>
               <w:spacing w:lineRule="auto" w:line="240" w:before="0" w:after="0"/>
               <w:jc w:val="start"/>
               <w:rPr>
@@ -173,14 +171,7 @@
               </w:rPr>
             </w:pPr>
             <w:r>
-              <w:rPr>
-                <w:rFonts w:eastAsia="ＭＳ 明朝" w:cs=""/>
-                <w:kern w:val="0"/>
-                <w:szCs w:val="22"/>
-                <w:lang w:val="en-US" w:eastAsia="en-US" w:bidi="ar-SA"/>
-              </w:rPr>
-            </w:r>
-            <w:r>
+              <w:rPr/>
               <w:t>{artDerVeranstaltung}</w:t>
             </w:r>
           </w:p>
@@ -188,6 +179,7 @@
             <w:pPr>
               <w:pStyle w:val="Normal"/>
               <w:widowControl/>
+              <w:suppressAutoHyphens w:val="true"/>
               <w:spacing w:lineRule="auto" w:line="240" w:before="0" w:after="0"/>
               <w:jc w:val="start"/>
               <w:rPr>
@@ -219,6 +211,7 @@
             <w:pPr>
               <w:pStyle w:val="Normal"/>
               <w:widowControl/>
+              <w:suppressAutoHyphens w:val="true"/>
               <w:spacing w:lineRule="auto" w:line="240" w:before="0" w:after="0"/>
               <w:jc w:val="start"/>
               <w:rPr>
@@ -242,13 +235,14 @@
         </w:tc>
         <w:tc>
           <w:tcPr>
-            <w:tcW w:w="6236" w:type="dxa"/>
+            <w:tcW w:w="6393" w:type="dxa"/>
             <w:tcBorders/>
           </w:tcPr>
           <w:p>
             <w:pPr>
               <w:pStyle w:val="Normal"/>
               <w:widowControl/>
+              <w:suppressAutoHyphens w:val="true"/>
               <w:spacing w:lineRule="auto" w:line="240" w:before="0" w:after="0"/>
               <w:jc w:val="start"/>
               <w:rPr>
@@ -270,6 +264,7 @@
               <w:t>Datum/Uhrzeit:</w:t>
             </w:r>
             <w:r>
+              <w:rPr/>
               <w:t xml:space="preserve"> {beginnDatum} {beginnUhrzeit}</w:t>
             </w:r>
           </w:p>
@@ -277,6 +272,7 @@
             <w:pPr>
               <w:pStyle w:val="Normal"/>
               <w:widowControl/>
+              <w:suppressAutoHyphens w:val="true"/>
               <w:spacing w:lineRule="auto" w:line="240" w:before="0" w:after="0"/>
               <w:jc w:val="start"/>
               <w:rPr>
@@ -310,6 +306,7 @@
             <w:pPr>
               <w:pStyle w:val="Normal"/>
               <w:widowControl/>
+              <w:suppressAutoHyphens w:val="true"/>
               <w:spacing w:lineRule="auto" w:line="240" w:before="0" w:after="0"/>
               <w:jc w:val="start"/>
               <w:rPr>
@@ -333,13 +330,14 @@
         </w:tc>
         <w:tc>
           <w:tcPr>
-            <w:tcW w:w="6236" w:type="dxa"/>
+            <w:tcW w:w="6393" w:type="dxa"/>
             <w:tcBorders/>
           </w:tcPr>
           <w:p>
             <w:pPr>
               <w:pStyle w:val="Normal"/>
               <w:widowControl/>
+              <w:suppressAutoHyphens w:val="true"/>
               <w:spacing w:lineRule="auto" w:line="240" w:before="0" w:after="0"/>
               <w:jc w:val="start"/>
               <w:rPr>
@@ -350,14 +348,7 @@
               </w:rPr>
             </w:pPr>
             <w:r>
-              <w:rPr>
-                <w:rFonts w:eastAsia="ＭＳ 明朝" w:cs=""/>
-                <w:kern w:val="0"/>
-                <w:szCs w:val="22"/>
-                <w:lang w:val="en-US" w:eastAsia="en-US" w:bidi="ar-SA"/>
-              </w:rPr>
-            </w:r>
-            <w:r>
+              <w:rPr/>
               <w:t>{ansprechpartner}</w:t>
             </w:r>
           </w:p>
@@ -376,7 +367,7 @@
     <w:tbl>
       <w:tblPr>
         <w:tblStyle w:val="TableGrid"/>
-        <w:tblW w:w="9638" w:type="dxa"/>
+        <w:tblW w:w="9795" w:type="dxa"/>
         <w:jc w:val="start"/>
         <w:tblInd w:w="0" w:type="dxa"/>
         <w:tblLayout w:type="fixed"/>
@@ -390,7 +381,7 @@
       </w:tblPr>
       <w:tblGrid>
         <w:gridCol w:w="3402"/>
-        <w:gridCol w:w="6236"/>
+        <w:gridCol w:w="6393"/>
       </w:tblGrid>
       <w:tr>
         <w:trPr/>
@@ -403,6 +394,7 @@
             <w:pPr>
               <w:pStyle w:val="Normal"/>
               <w:widowControl/>
+              <w:suppressAutoHyphens w:val="true"/>
               <w:spacing w:lineRule="auto" w:line="240" w:before="0" w:after="0"/>
               <w:jc w:val="start"/>
               <w:rPr>
@@ -426,13 +418,14 @@
         </w:tc>
         <w:tc>
           <w:tcPr>
-            <w:tcW w:w="6236" w:type="dxa"/>
+            <w:tcW w:w="6393" w:type="dxa"/>
             <w:tcBorders/>
           </w:tcPr>
           <w:p>
             <w:pPr>
               <w:pStyle w:val="Normal"/>
               <w:widowControl/>
+              <w:suppressAutoHyphens w:val="true"/>
               <w:spacing w:lineRule="auto" w:line="240" w:before="0" w:after="0"/>
               <w:jc w:val="start"/>
               <w:rPr>
@@ -454,6 +447,7 @@
               <w:t>Datum/Uhrzeit:</w:t>
             </w:r>
             <w:r>
+              <w:rPr/>
               <w:t xml:space="preserve"> {dienstantrittDatum} {dienstantrittUhrzeit}</w:t>
             </w:r>
           </w:p>
@@ -461,6 +455,7 @@
             <w:pPr>
               <w:pStyle w:val="Normal"/>
               <w:widowControl/>
+              <w:suppressAutoHyphens w:val="true"/>
               <w:spacing w:lineRule="auto" w:line="240" w:before="0" w:after="0"/>
               <w:jc w:val="start"/>
               <w:rPr>
@@ -494,6 +489,7 @@
             <w:pPr>
               <w:pStyle w:val="Normal"/>
               <w:widowControl/>
+              <w:suppressAutoHyphens w:val="true"/>
               <w:spacing w:lineRule="auto" w:line="240" w:before="0" w:after="0"/>
               <w:jc w:val="start"/>
               <w:rPr>
@@ -517,13 +513,14 @@
         </w:tc>
         <w:tc>
           <w:tcPr>
-            <w:tcW w:w="6236" w:type="dxa"/>
+            <w:tcW w:w="6393" w:type="dxa"/>
             <w:tcBorders/>
           </w:tcPr>
           <w:p>
             <w:pPr>
               <w:pStyle w:val="Normal"/>
               <w:widowControl/>
+              <w:suppressAutoHyphens w:val="true"/>
               <w:spacing w:lineRule="auto" w:line="240" w:before="0" w:after="0"/>
               <w:jc w:val="start"/>
               <w:rPr>
@@ -545,6 +542,7 @@
               <w:t>Datum/Uhrzeit:</w:t>
             </w:r>
             <w:r>
+              <w:rPr/>
               <w:t xml:space="preserve"> {dienstendeDatum} {dienstendeUhrzeit}</w:t>
             </w:r>
           </w:p>
@@ -561,6 +559,7 @@
             <w:pPr>
               <w:pStyle w:val="Normal"/>
               <w:widowControl/>
+              <w:suppressAutoHyphens w:val="true"/>
               <w:spacing w:lineRule="auto" w:line="240" w:before="0" w:after="0"/>
               <w:jc w:val="start"/>
               <w:rPr>
@@ -584,13 +583,14 @@
         </w:tc>
         <w:tc>
           <w:tcPr>
-            <w:tcW w:w="6236" w:type="dxa"/>
+            <w:tcW w:w="6393" w:type="dxa"/>
             <w:tcBorders/>
           </w:tcPr>
           <w:p>
             <w:pPr>
               <w:pStyle w:val="Normal"/>
               <w:widowControl/>
+              <w:suppressAutoHyphens w:val="true"/>
               <w:spacing w:lineRule="auto" w:line="240" w:before="0" w:after="0"/>
               <w:jc w:val="start"/>
               <w:rPr>
@@ -612,6 +612,7 @@
               <w:t>Name, Vorname:</w:t>
             </w:r>
             <w:r>
+              <w:rPr/>
               <w:t xml:space="preserve"> {wachhabender}</w:t>
             </w:r>
           </w:p>
@@ -628,6 +629,7 @@
             <w:pPr>
               <w:pStyle w:val="Normal"/>
               <w:widowControl/>
+              <w:suppressAutoHyphens w:val="true"/>
               <w:spacing w:lineRule="auto" w:line="240" w:before="0" w:after="0"/>
               <w:jc w:val="start"/>
               <w:rPr>
@@ -651,13 +653,14 @@
         </w:tc>
         <w:tc>
           <w:tcPr>
-            <w:tcW w:w="6236" w:type="dxa"/>
+            <w:tcW w:w="6393" w:type="dxa"/>
             <w:tcBorders/>
           </w:tcPr>
           <w:p>
             <w:pPr>
               <w:pStyle w:val="Normal"/>
               <w:widowControl/>
+              <w:suppressAutoHyphens w:val="true"/>
               <w:spacing w:lineRule="auto" w:line="240" w:before="0" w:after="0"/>
               <w:jc w:val="start"/>
               <w:rPr>
@@ -679,6 +682,7 @@
               <w:t>Name, Vorname:</w:t>
             </w:r>
             <w:r>
+              <w:rPr/>
               <w:t xml:space="preserve"> {wachposten1}</w:t>
             </w:r>
           </w:p>
@@ -695,6 +699,7 @@
             <w:pPr>
               <w:pStyle w:val="Normal"/>
               <w:widowControl/>
+              <w:suppressAutoHyphens w:val="true"/>
               <w:spacing w:lineRule="auto" w:line="240" w:before="0" w:after="0"/>
               <w:jc w:val="start"/>
               <w:rPr>
@@ -718,13 +723,14 @@
         </w:tc>
         <w:tc>
           <w:tcPr>
-            <w:tcW w:w="6236" w:type="dxa"/>
+            <w:tcW w:w="6393" w:type="dxa"/>
             <w:tcBorders/>
           </w:tcPr>
           <w:p>
             <w:pPr>
               <w:pStyle w:val="Normal"/>
               <w:widowControl/>
+              <w:suppressAutoHyphens w:val="true"/>
               <w:spacing w:lineRule="auto" w:line="240" w:before="0" w:after="0"/>
               <w:jc w:val="start"/>
               <w:rPr>
@@ -746,6 +752,7 @@
               <w:t>Name, Vorname:</w:t>
             </w:r>
             <w:r>
+              <w:rPr/>
               <w:t xml:space="preserve"> {wachposten2}</w:t>
             </w:r>
           </w:p>
@@ -762,6 +769,7 @@
             <w:pPr>
               <w:pStyle w:val="Normal"/>
               <w:widowControl/>
+              <w:suppressAutoHyphens w:val="true"/>
               <w:spacing w:lineRule="auto" w:line="240" w:before="0" w:after="0"/>
               <w:jc w:val="start"/>
               <w:rPr>
@@ -785,13 +793,14 @@
         </w:tc>
         <w:tc>
           <w:tcPr>
-            <w:tcW w:w="6236" w:type="dxa"/>
+            <w:tcW w:w="6393" w:type="dxa"/>
             <w:tcBorders/>
           </w:tcPr>
           <w:p>
             <w:pPr>
               <w:pStyle w:val="Normal"/>
               <w:widowControl/>
+              <w:suppressAutoHyphens w:val="true"/>
               <w:spacing w:lineRule="auto" w:line="240" w:before="0" w:after="0"/>
               <w:jc w:val="start"/>
               <w:rPr>
@@ -813,6 +822,7 @@
               <w:t>Name, Vorname:</w:t>
             </w:r>
             <w:r>
+              <w:rPr/>
               <w:t xml:space="preserve"> {wachposten3}</w:t>
             </w:r>
           </w:p>
@@ -831,7 +841,7 @@
     <w:tbl>
       <w:tblPr>
         <w:tblStyle w:val="TableGrid"/>
-        <w:tblW w:w="9638" w:type="dxa"/>
+        <w:tblW w:w="9795" w:type="dxa"/>
         <w:jc w:val="start"/>
         <w:tblInd w:w="0" w:type="dxa"/>
         <w:tblLayout w:type="fixed"/>
@@ -845,7 +855,7 @@
       </w:tblPr>
       <w:tblGrid>
         <w:gridCol w:w="3402"/>
-        <w:gridCol w:w="6236"/>
+        <w:gridCol w:w="6393"/>
       </w:tblGrid>
       <w:tr>
         <w:trPr/>
@@ -858,6 +868,7 @@
             <w:pPr>
               <w:pStyle w:val="Normal"/>
               <w:widowControl/>
+              <w:suppressAutoHyphens w:val="true"/>
               <w:spacing w:lineRule="auto" w:line="240" w:before="0" w:after="0"/>
               <w:jc w:val="start"/>
               <w:rPr>
@@ -881,13 +892,14 @@
         </w:tc>
         <w:tc>
           <w:tcPr>
-            <w:tcW w:w="6236" w:type="dxa"/>
+            <w:tcW w:w="6393" w:type="dxa"/>
             <w:tcBorders/>
           </w:tcPr>
           <w:p>
             <w:pPr>
               <w:pStyle w:val="Normal"/>
               <w:widowControl/>
+              <w:suppressAutoHyphens w:val="true"/>
               <w:spacing w:lineRule="auto" w:line="240" w:before="0" w:after="0"/>
               <w:jc w:val="start"/>
               <w:rPr>
@@ -898,14 +910,7 @@
               </w:rPr>
             </w:pPr>
             <w:r>
-              <w:rPr>
-                <w:rFonts w:eastAsia="ＭＳ 明朝" w:cs=""/>
-                <w:kern w:val="0"/>
-                <w:szCs w:val="22"/>
-                <w:lang w:val="en-US" w:eastAsia="en-US" w:bidi="ar-SA"/>
-              </w:rPr>
-            </w:r>
-            <w:r>
+              <w:rPr/>
               <w:t>{maengel}</w:t>
             </w:r>
           </w:p>
@@ -913,6 +918,7 @@
             <w:pPr>
               <w:pStyle w:val="Normal"/>
               <w:widowControl/>
+              <w:suppressAutoHyphens w:val="true"/>
               <w:spacing w:lineRule="auto" w:line="240" w:before="0" w:after="0"/>
               <w:jc w:val="start"/>
               <w:rPr>
@@ -935,6 +941,7 @@
             <w:pPr>
               <w:pStyle w:val="Normal"/>
               <w:widowControl/>
+              <w:suppressAutoHyphens w:val="true"/>
               <w:spacing w:lineRule="auto" w:line="240" w:before="0" w:after="0"/>
               <w:jc w:val="start"/>
               <w:rPr>
@@ -957,6 +964,7 @@
             <w:pPr>
               <w:pStyle w:val="Normal"/>
               <w:widowControl/>
+              <w:suppressAutoHyphens w:val="true"/>
               <w:spacing w:lineRule="auto" w:line="240" w:before="0" w:after="0"/>
               <w:jc w:val="start"/>
               <w:rPr>
@@ -979,6 +987,7 @@
             <w:pPr>
               <w:pStyle w:val="Normal"/>
               <w:widowControl/>
+              <w:suppressAutoHyphens w:val="true"/>
               <w:spacing w:lineRule="auto" w:line="240" w:before="0" w:after="0"/>
               <w:jc w:val="start"/>
               <w:rPr>
@@ -1010,6 +1019,7 @@
             <w:pPr>
               <w:pStyle w:val="Normal"/>
               <w:widowControl/>
+              <w:suppressAutoHyphens w:val="true"/>
               <w:spacing w:lineRule="auto" w:line="240" w:before="0" w:after="0"/>
               <w:jc w:val="start"/>
               <w:rPr>
@@ -1034,6 +1044,7 @@
             <w:pPr>
               <w:pStyle w:val="Normal"/>
               <w:widowControl/>
+              <w:suppressAutoHyphens w:val="true"/>
               <w:spacing w:lineRule="auto" w:line="240" w:before="0" w:after="0"/>
               <w:jc w:val="start"/>
               <w:rPr>
@@ -1058,13 +1069,14 @@
         </w:tc>
         <w:tc>
           <w:tcPr>
-            <w:tcW w:w="6236" w:type="dxa"/>
+            <w:tcW w:w="6393" w:type="dxa"/>
             <w:tcBorders/>
           </w:tcPr>
           <w:p>
             <w:pPr>
               <w:pStyle w:val="Normal"/>
               <w:widowControl/>
+              <w:suppressAutoHyphens w:val="true"/>
               <w:spacing w:lineRule="auto" w:line="240" w:before="0" w:after="0"/>
               <w:jc w:val="start"/>
               <w:rPr>
@@ -1075,14 +1087,7 @@
               </w:rPr>
             </w:pPr>
             <w:r>
-              <w:rPr>
-                <w:rFonts w:eastAsia="ＭＳ 明朝" w:cs=""/>
-                <w:kern w:val="0"/>
-                <w:szCs w:val="22"/>
-                <w:lang w:val="en-US" w:eastAsia="en-US" w:bidi="ar-SA"/>
-              </w:rPr>
-            </w:r>
-            <w:r>
+              <w:rPr/>
               <w:t>{vorkommnisse}</w:t>
             </w:r>
           </w:p>
@@ -1090,6 +1095,7 @@
             <w:pPr>
               <w:pStyle w:val="Normal"/>
               <w:widowControl/>
+              <w:suppressAutoHyphens w:val="true"/>
               <w:spacing w:lineRule="auto" w:line="240" w:before="0" w:after="0"/>
               <w:jc w:val="start"/>
               <w:rPr>
@@ -1112,6 +1118,7 @@
             <w:pPr>
               <w:pStyle w:val="Normal"/>
               <w:widowControl/>
+              <w:suppressAutoHyphens w:val="true"/>
               <w:spacing w:lineRule="auto" w:line="240" w:before="0" w:after="0"/>
               <w:jc w:val="start"/>
               <w:rPr>
@@ -1134,6 +1141,7 @@
             <w:pPr>
               <w:pStyle w:val="Normal"/>
               <w:widowControl/>
+              <w:suppressAutoHyphens w:val="true"/>
               <w:spacing w:lineRule="auto" w:line="240" w:before="0" w:after="0"/>
               <w:jc w:val="start"/>
               <w:rPr>
@@ -1156,6 +1164,7 @@
             <w:pPr>
               <w:pStyle w:val="Normal"/>
               <w:widowControl/>
+              <w:suppressAutoHyphens w:val="true"/>
               <w:spacing w:lineRule="auto" w:line="240" w:before="0" w:after="0"/>
               <w:jc w:val="start"/>
               <w:rPr>
@@ -1189,7 +1198,7 @@
     <w:tbl>
       <w:tblPr>
         <w:tblStyle w:val="TableGrid"/>
-        <w:tblW w:w="9642" w:type="dxa"/>
+        <w:tblW w:w="9795" w:type="dxa"/>
         <w:jc w:val="start"/>
         <w:tblInd w:w="0" w:type="dxa"/>
         <w:tblLayout w:type="fixed"/>
@@ -1204,7 +1213,7 @@
       <w:tblGrid>
         <w:gridCol w:w="3214"/>
         <w:gridCol w:w="3214"/>
-        <w:gridCol w:w="3214"/>
+        <w:gridCol w:w="3367"/>
       </w:tblGrid>
       <w:tr>
         <w:trPr/>
@@ -1217,6 +1226,7 @@
             <w:pPr>
               <w:pStyle w:val="Normal"/>
               <w:widowControl/>
+              <w:suppressAutoHyphens w:val="true"/>
               <w:spacing w:lineRule="auto" w:line="240" w:before="0" w:after="0"/>
               <w:jc w:val="start"/>
               <w:rPr>
@@ -1239,6 +1249,7 @@
             <w:pPr>
               <w:pStyle w:val="Normal"/>
               <w:widowControl/>
+              <w:suppressAutoHyphens w:val="true"/>
               <w:spacing w:lineRule="auto" w:line="240" w:before="0" w:after="0"/>
               <w:jc w:val="start"/>
               <w:rPr>
@@ -1267,6 +1278,7 @@
             <w:pPr>
               <w:pStyle w:val="Normal"/>
               <w:widowControl/>
+              <w:suppressAutoHyphens w:val="true"/>
               <w:spacing w:lineRule="auto" w:line="240" w:before="0" w:after="0"/>
               <w:jc w:val="start"/>
               <w:rPr>
@@ -1288,13 +1300,14 @@
         </w:tc>
         <w:tc>
           <w:tcPr>
-            <w:tcW w:w="3214" w:type="dxa"/>
+            <w:tcW w:w="3367" w:type="dxa"/>
             <w:tcBorders/>
           </w:tcPr>
           <w:p>
             <w:pPr>
               <w:pStyle w:val="Normal"/>
               <w:widowControl/>
+              <w:suppressAutoHyphens w:val="true"/>
               <w:spacing w:lineRule="auto" w:line="240" w:before="0" w:after="0"/>
               <w:jc w:val="start"/>
               <w:rPr>
@@ -1328,6 +1341,7 @@
             <w:pPr>
               <w:pStyle w:val="Normal"/>
               <w:widowControl/>
+              <w:suppressAutoHyphens w:val="true"/>
               <w:spacing w:lineRule="auto" w:line="240" w:before="0" w:after="0"/>
               <w:jc w:val="start"/>
               <w:rPr>
@@ -1358,6 +1372,7 @@
             <w:pPr>
               <w:pStyle w:val="Normal"/>
               <w:widowControl/>
+              <w:suppressAutoHyphens w:val="true"/>
               <w:spacing w:lineRule="auto" w:line="240" w:before="0" w:after="0"/>
               <w:jc w:val="start"/>
               <w:rPr>
@@ -1381,13 +1396,14 @@
         </w:tc>
         <w:tc>
           <w:tcPr>
-            <w:tcW w:w="3214" w:type="dxa"/>
+            <w:tcW w:w="3367" w:type="dxa"/>
             <w:tcBorders/>
           </w:tcPr>
           <w:p>
             <w:pPr>
               <w:pStyle w:val="Normal"/>
               <w:widowControl/>
+              <w:suppressAutoHyphens w:val="true"/>
               <w:spacing w:lineRule="auto" w:line="240" w:before="0" w:after="0"/>
               <w:jc w:val="start"/>
               <w:rPr>
@@ -1454,9 +1470,9 @@
   </w:p>
   <w:tbl>
     <w:tblPr>
-      <w:tblW w:w="9638" w:type="dxa"/>
+      <w:tblW w:w="9759" w:type="dxa"/>
       <w:jc w:val="start"/>
-      <w:tblInd w:w="108" w:type="dxa"/>
+      <w:tblInd w:w="39" w:type="dxa"/>
       <w:tblLayout w:type="fixed"/>
       <w:tblCellMar>
         <w:top w:w="0" w:type="dxa"/>
@@ -1467,15 +1483,18 @@
       <w:tblLook w:val="04a0" w:noHBand="0" w:noVBand="1" w:firstColumn="1" w:lastRow="0" w:lastColumn="0" w:firstRow="1"/>
     </w:tblPr>
     <w:tblGrid>
-      <w:gridCol w:w="9638"/>
+      <w:gridCol w:w="9759"/>
     </w:tblGrid>
     <w:tr>
       <w:trPr/>
       <w:tc>
         <w:tcPr>
-          <w:tcW w:w="9638" w:type="dxa"/>
+          <w:tcW w:w="9759" w:type="dxa"/>
           <w:tcBorders>
+            <w:top w:val="single" w:sz="4" w:space="0" w:color="000000"/>
+            <w:start w:val="single" w:sz="4" w:space="0" w:color="000000"/>
             <w:bottom w:val="single" w:sz="4" w:space="0" w:color="000000"/>
+            <w:end w:val="single" w:sz="4" w:space="0" w:color="000000"/>
           </w:tcBorders>
         </w:tcPr>
         <w:p>
@@ -1502,15 +1521,15 @@
             <w:tblLook w:val="04a0" w:noHBand="0" w:noVBand="1" w:firstColumn="1" w:lastRow="0" w:lastColumn="0" w:firstRow="1"/>
           </w:tblPr>
           <w:tblGrid>
-            <w:gridCol w:w="2267"/>
+            <w:gridCol w:w="2266"/>
             <w:gridCol w:w="5386"/>
-            <w:gridCol w:w="1985"/>
+            <w:gridCol w:w="1986"/>
           </w:tblGrid>
           <w:tr>
             <w:trPr/>
             <w:tc>
               <w:tcPr>
-                <w:tcW w:w="2267" w:type="dxa"/>
+                <w:tcW w:w="2266" w:type="dxa"/>
                 <w:tcBorders>
                   <w:end w:val="single" w:sz="4" w:space="0" w:color="000000"/>
                 </w:tcBorders>
@@ -1623,7 +1642,7 @@
             </w:tc>
             <w:tc>
               <w:tcPr>
-                <w:tcW w:w="1985" w:type="dxa"/>
+                <w:tcW w:w="1986" w:type="dxa"/>
                 <w:tcBorders/>
                 <w:vAlign w:val="center"/>
               </w:tcPr>
@@ -1638,14 +1657,7 @@
                     <w:b/>
                     <w:sz w:val="18"/>
                   </w:rPr>
-                  <w:t xml:space="preserve">BR </w:t>
-                </w:r>
-                <w:r>
-                  <w:rPr>
-                    <w:b/>
-                    <w:sz w:val="18"/>
-                  </w:rPr>
-                  <w:t>BSW</w:t>
+                  <w:t>BR BSW</w:t>
                 </w:r>
               </w:p>
               <w:p>
@@ -1758,8 +1770,13 @@
       <w:trPr/>
       <w:tc>
         <w:tcPr>
-          <w:tcW w:w="9638" w:type="dxa"/>
-          <w:tcBorders/>
+          <w:tcW w:w="9759" w:type="dxa"/>
+          <w:tcBorders>
+            <w:top w:val="single" w:sz="4" w:space="0" w:color="000000"/>
+            <w:start w:val="single" w:sz="4" w:space="0" w:color="000000"/>
+            <w:bottom w:val="single" w:sz="4" w:space="0" w:color="000000"/>
+            <w:end w:val="single" w:sz="4" w:space="0" w:color="000000"/>
+          </w:tcBorders>
         </w:tcPr>
         <w:p>
           <w:pPr>
@@ -1785,14 +1802,14 @@
             <w:tblLook w:val="04a0" w:noHBand="0" w:noVBand="1" w:firstColumn="1" w:lastRow="0" w:lastColumn="0" w:firstRow="1"/>
           </w:tblPr>
           <w:tblGrid>
-            <w:gridCol w:w="6235"/>
-            <w:gridCol w:w="3403"/>
+            <w:gridCol w:w="6234"/>
+            <w:gridCol w:w="3404"/>
           </w:tblGrid>
           <w:tr>
             <w:trPr/>
             <w:tc>
               <w:tcPr>
-                <w:tcW w:w="6235" w:type="dxa"/>
+                <w:tcW w:w="6234" w:type="dxa"/>
                 <w:tcBorders>
                   <w:top w:val="single" w:sz="6" w:space="0" w:color="000000"/>
                   <w:end w:val="single" w:sz="4" w:space="0" w:color="000000"/>
@@ -1818,7 +1835,7 @@
             </w:tc>
             <w:tc>
               <w:tcPr>
-                <w:tcW w:w="3403" w:type="dxa"/>
+                <w:tcW w:w="3404" w:type="dxa"/>
                 <w:tcBorders>
                   <w:top w:val="single" w:sz="6" w:space="0" w:color="000000"/>
                 </w:tcBorders>
@@ -1875,9 +1892,9 @@
   </w:p>
   <w:tbl>
     <w:tblPr>
-      <w:tblW w:w="9638" w:type="dxa"/>
+      <w:tblW w:w="9759" w:type="dxa"/>
       <w:jc w:val="start"/>
-      <w:tblInd w:w="108" w:type="dxa"/>
+      <w:tblInd w:w="39" w:type="dxa"/>
       <w:tblLayout w:type="fixed"/>
       <w:tblCellMar>
         <w:top w:w="0" w:type="dxa"/>
@@ -1888,15 +1905,18 @@
       <w:tblLook w:val="04a0" w:noHBand="0" w:noVBand="1" w:firstColumn="1" w:lastRow="0" w:lastColumn="0" w:firstRow="1"/>
     </w:tblPr>
     <w:tblGrid>
-      <w:gridCol w:w="9638"/>
+      <w:gridCol w:w="9759"/>
     </w:tblGrid>
     <w:tr>
       <w:trPr/>
       <w:tc>
         <w:tcPr>
-          <w:tcW w:w="9638" w:type="dxa"/>
+          <w:tcW w:w="9759" w:type="dxa"/>
           <w:tcBorders>
+            <w:top w:val="single" w:sz="4" w:space="0" w:color="000000"/>
+            <w:start w:val="single" w:sz="4" w:space="0" w:color="000000"/>
             <w:bottom w:val="single" w:sz="4" w:space="0" w:color="000000"/>
+            <w:end w:val="single" w:sz="4" w:space="0" w:color="000000"/>
           </w:tcBorders>
         </w:tcPr>
         <w:p>
@@ -1923,15 +1943,15 @@
             <w:tblLook w:val="04a0" w:noHBand="0" w:noVBand="1" w:firstColumn="1" w:lastRow="0" w:lastColumn="0" w:firstRow="1"/>
           </w:tblPr>
           <w:tblGrid>
-            <w:gridCol w:w="2267"/>
+            <w:gridCol w:w="2266"/>
             <w:gridCol w:w="5386"/>
-            <w:gridCol w:w="1985"/>
+            <w:gridCol w:w="1986"/>
           </w:tblGrid>
           <w:tr>
             <w:trPr/>
             <w:tc>
               <w:tcPr>
-                <w:tcW w:w="2267" w:type="dxa"/>
+                <w:tcW w:w="2266" w:type="dxa"/>
                 <w:tcBorders>
                   <w:end w:val="single" w:sz="4" w:space="0" w:color="000000"/>
                 </w:tcBorders>
@@ -2044,7 +2064,7 @@
             </w:tc>
             <w:tc>
               <w:tcPr>
-                <w:tcW w:w="1985" w:type="dxa"/>
+                <w:tcW w:w="1986" w:type="dxa"/>
                 <w:tcBorders/>
                 <w:vAlign w:val="center"/>
               </w:tcPr>
@@ -2059,14 +2079,7 @@
                     <w:b/>
                     <w:sz w:val="18"/>
                   </w:rPr>
-                  <w:t xml:space="preserve">BR </w:t>
-                </w:r>
-                <w:r>
-                  <w:rPr>
-                    <w:b/>
-                    <w:sz w:val="18"/>
-                  </w:rPr>
-                  <w:t>BSW</w:t>
+                  <w:t>BR BSW</w:t>
                 </w:r>
               </w:p>
               <w:p>
@@ -2179,8 +2192,13 @@
       <w:trPr/>
       <w:tc>
         <w:tcPr>
-          <w:tcW w:w="9638" w:type="dxa"/>
-          <w:tcBorders/>
+          <w:tcW w:w="9759" w:type="dxa"/>
+          <w:tcBorders>
+            <w:top w:val="single" w:sz="4" w:space="0" w:color="000000"/>
+            <w:start w:val="single" w:sz="4" w:space="0" w:color="000000"/>
+            <w:bottom w:val="single" w:sz="4" w:space="0" w:color="000000"/>
+            <w:end w:val="single" w:sz="4" w:space="0" w:color="000000"/>
+          </w:tcBorders>
         </w:tcPr>
         <w:p>
           <w:pPr>
@@ -2206,14 +2224,14 @@
             <w:tblLook w:val="04a0" w:noHBand="0" w:noVBand="1" w:firstColumn="1" w:lastRow="0" w:lastColumn="0" w:firstRow="1"/>
           </w:tblPr>
           <w:tblGrid>
-            <w:gridCol w:w="6235"/>
-            <w:gridCol w:w="3403"/>
+            <w:gridCol w:w="6234"/>
+            <w:gridCol w:w="3404"/>
           </w:tblGrid>
           <w:tr>
             <w:trPr/>
             <w:tc>
               <w:tcPr>
-                <w:tcW w:w="6235" w:type="dxa"/>
+                <w:tcW w:w="6234" w:type="dxa"/>
                 <w:tcBorders>
                   <w:top w:val="single" w:sz="6" w:space="0" w:color="000000"/>
                   <w:end w:val="single" w:sz="4" w:space="0" w:color="000000"/>
@@ -2239,7 +2257,7 @@
             </w:tc>
             <w:tc>
               <w:tcPr>
-                <w:tcW w:w="3403" w:type="dxa"/>
+                <w:tcW w:w="3404" w:type="dxa"/>
                 <w:tcBorders>
                   <w:top w:val="single" w:sz="6" w:space="0" w:color="000000"/>
                 </w:tcBorders>
@@ -2312,6 +2330,7 @@
         </w:tabs>
         <w:ind w:start="1080" w:hanging="360"/>
       </w:pPr>
+      <w:rPr/>
     </w:lvl>
     <w:lvl w:ilvl="2">
       <w:start w:val="1"/>
@@ -2324,6 +2343,7 @@
         </w:tabs>
         <w:ind w:start="1440" w:hanging="360"/>
       </w:pPr>
+      <w:rPr/>
     </w:lvl>
     <w:lvl w:ilvl="3">
       <w:start w:val="1"/>
@@ -2336,6 +2356,7 @@
         </w:tabs>
         <w:ind w:start="1800" w:hanging="360"/>
       </w:pPr>
+      <w:rPr/>
     </w:lvl>
     <w:lvl w:ilvl="4">
       <w:start w:val="1"/>
@@ -2348,6 +2369,7 @@
         </w:tabs>
         <w:ind w:start="2160" w:hanging="360"/>
       </w:pPr>
+      <w:rPr/>
     </w:lvl>
     <w:lvl w:ilvl="5">
       <w:start w:val="1"/>
@@ -2360,6 +2382,7 @@
         </w:tabs>
         <w:ind w:start="2520" w:hanging="360"/>
       </w:pPr>
+      <w:rPr/>
     </w:lvl>
     <w:lvl w:ilvl="6">
       <w:start w:val="1"/>
@@ -2372,6 +2395,7 @@
         </w:tabs>
         <w:ind w:start="2880" w:hanging="360"/>
       </w:pPr>
+      <w:rPr/>
     </w:lvl>
     <w:lvl w:ilvl="7">
       <w:start w:val="1"/>
@@ -2384,6 +2408,7 @@
         </w:tabs>
         <w:ind w:start="3240" w:hanging="360"/>
       </w:pPr>
+      <w:rPr/>
     </w:lvl>
     <w:lvl w:ilvl="8">
       <w:start w:val="1"/>
@@ -2396,6 +2421,7 @@
         </w:tabs>
         <w:ind w:start="3600" w:hanging="360"/>
       </w:pPr>
+      <w:rPr/>
     </w:lvl>
   </w:abstractNum>
   <w:abstractNum w:abstractNumId="2">
@@ -2425,6 +2451,7 @@
         </w:tabs>
         <w:ind w:start="1080" w:hanging="360"/>
       </w:pPr>
+      <w:rPr/>
     </w:lvl>
     <w:lvl w:ilvl="2">
       <w:start w:val="1"/>
@@ -2437,6 +2464,7 @@
         </w:tabs>
         <w:ind w:start="1440" w:hanging="360"/>
       </w:pPr>
+      <w:rPr/>
     </w:lvl>
     <w:lvl w:ilvl="3">
       <w:start w:val="1"/>
@@ -2449,6 +2477,7 @@
         </w:tabs>
         <w:ind w:start="1800" w:hanging="360"/>
       </w:pPr>
+      <w:rPr/>
     </w:lvl>
     <w:lvl w:ilvl="4">
       <w:start w:val="1"/>
@@ -2461,6 +2490,7 @@
         </w:tabs>
         <w:ind w:start="2160" w:hanging="360"/>
       </w:pPr>
+      <w:rPr/>
     </w:lvl>
     <w:lvl w:ilvl="5">
       <w:start w:val="1"/>
@@ -2473,6 +2503,7 @@
         </w:tabs>
         <w:ind w:start="2520" w:hanging="360"/>
       </w:pPr>
+      <w:rPr/>
     </w:lvl>
     <w:lvl w:ilvl="6">
       <w:start w:val="1"/>
@@ -2485,6 +2516,7 @@
         </w:tabs>
         <w:ind w:start="2880" w:hanging="360"/>
       </w:pPr>
+      <w:rPr/>
     </w:lvl>
     <w:lvl w:ilvl="7">
       <w:start w:val="1"/>
@@ -2497,6 +2529,7 @@
         </w:tabs>
         <w:ind w:start="3240" w:hanging="360"/>
       </w:pPr>
+      <w:rPr/>
     </w:lvl>
     <w:lvl w:ilvl="8">
       <w:start w:val="1"/>
@@ -2509,6 +2542,7 @@
         </w:tabs>
         <w:ind w:start="3600" w:hanging="360"/>
       </w:pPr>
+      <w:rPr/>
     </w:lvl>
   </w:abstractNum>
   <w:abstractNum w:abstractNumId="3">
@@ -2538,6 +2572,7 @@
         </w:tabs>
         <w:ind w:start="1080" w:hanging="360"/>
       </w:pPr>
+      <w:rPr/>
     </w:lvl>
     <w:lvl w:ilvl="2">
       <w:start w:val="1"/>
@@ -2550,6 +2585,7 @@
         </w:tabs>
         <w:ind w:start="1440" w:hanging="360"/>
       </w:pPr>
+      <w:rPr/>
     </w:lvl>
     <w:lvl w:ilvl="3">
       <w:start w:val="1"/>
@@ -2562,6 +2598,7 @@
         </w:tabs>
         <w:ind w:start="1800" w:hanging="360"/>
       </w:pPr>
+      <w:rPr/>
     </w:lvl>
     <w:lvl w:ilvl="4">
       <w:start w:val="1"/>
@@ -2574,6 +2611,7 @@
         </w:tabs>
         <w:ind w:start="2160" w:hanging="360"/>
       </w:pPr>
+      <w:rPr/>
     </w:lvl>
     <w:lvl w:ilvl="5">
       <w:start w:val="1"/>
@@ -2586,6 +2624,7 @@
         </w:tabs>
         <w:ind w:start="2520" w:hanging="360"/>
       </w:pPr>
+      <w:rPr/>
     </w:lvl>
     <w:lvl w:ilvl="6">
       <w:start w:val="1"/>
@@ -2598,6 +2637,7 @@
         </w:tabs>
         <w:ind w:start="2880" w:hanging="360"/>
       </w:pPr>
+      <w:rPr/>
     </w:lvl>
     <w:lvl w:ilvl="7">
       <w:start w:val="1"/>
@@ -2610,6 +2650,7 @@
         </w:tabs>
         <w:ind w:start="3240" w:hanging="360"/>
       </w:pPr>
+      <w:rPr/>
     </w:lvl>
     <w:lvl w:ilvl="8">
       <w:start w:val="1"/>
@@ -2622,6 +2663,7 @@
         </w:tabs>
         <w:ind w:start="3600" w:hanging="360"/>
       </w:pPr>
+      <w:rPr/>
     </w:lvl>
   </w:abstractNum>
   <w:abstractNum w:abstractNumId="4">
@@ -2649,6 +2691,7 @@
         </w:tabs>
         <w:ind w:start="1080" w:hanging="360"/>
       </w:pPr>
+      <w:rPr/>
     </w:lvl>
     <w:lvl w:ilvl="2">
       <w:start w:val="1"/>
@@ -2661,6 +2704,7 @@
         </w:tabs>
         <w:ind w:start="1440" w:hanging="360"/>
       </w:pPr>
+      <w:rPr/>
     </w:lvl>
     <w:lvl w:ilvl="3">
       <w:start w:val="1"/>
@@ -2673,6 +2717,7 @@
         </w:tabs>
         <w:ind w:start="1800" w:hanging="360"/>
       </w:pPr>
+      <w:rPr/>
     </w:lvl>
     <w:lvl w:ilvl="4">
       <w:start w:val="1"/>
@@ -2685,6 +2730,7 @@
         </w:tabs>
         <w:ind w:start="2160" w:hanging="360"/>
       </w:pPr>
+      <w:rPr/>
     </w:lvl>
     <w:lvl w:ilvl="5">
       <w:start w:val="1"/>
@@ -2697,6 +2743,7 @@
         </w:tabs>
         <w:ind w:start="2520" w:hanging="360"/>
       </w:pPr>
+      <w:rPr/>
     </w:lvl>
     <w:lvl w:ilvl="6">
       <w:start w:val="1"/>
@@ -2709,6 +2756,7 @@
         </w:tabs>
         <w:ind w:start="2880" w:hanging="360"/>
       </w:pPr>
+      <w:rPr/>
     </w:lvl>
     <w:lvl w:ilvl="7">
       <w:start w:val="1"/>
@@ -2721,6 +2769,7 @@
         </w:tabs>
         <w:ind w:start="3240" w:hanging="360"/>
       </w:pPr>
+      <w:rPr/>
     </w:lvl>
     <w:lvl w:ilvl="8">
       <w:start w:val="1"/>
@@ -2733,6 +2782,7 @@
         </w:tabs>
         <w:ind w:start="3600" w:hanging="360"/>
       </w:pPr>
+      <w:rPr/>
     </w:lvl>
   </w:abstractNum>
   <w:abstractNum w:abstractNumId="5">
@@ -2760,6 +2810,7 @@
         </w:tabs>
         <w:ind w:start="1080" w:hanging="360"/>
       </w:pPr>
+      <w:rPr/>
     </w:lvl>
     <w:lvl w:ilvl="2">
       <w:start w:val="1"/>
@@ -2772,6 +2823,7 @@
         </w:tabs>
         <w:ind w:start="1440" w:hanging="360"/>
       </w:pPr>
+      <w:rPr/>
     </w:lvl>
     <w:lvl w:ilvl="3">
       <w:start w:val="1"/>
@@ -2784,6 +2836,7 @@
         </w:tabs>
         <w:ind w:start="1800" w:hanging="360"/>
       </w:pPr>
+      <w:rPr/>
     </w:lvl>
     <w:lvl w:ilvl="4">
       <w:start w:val="1"/>
@@ -2796,6 +2849,7 @@
         </w:tabs>
         <w:ind w:start="2160" w:hanging="360"/>
       </w:pPr>
+      <w:rPr/>
     </w:lvl>
     <w:lvl w:ilvl="5">
       <w:start w:val="1"/>
@@ -2808,6 +2862,7 @@
         </w:tabs>
         <w:ind w:start="2520" w:hanging="360"/>
       </w:pPr>
+      <w:rPr/>
     </w:lvl>
     <w:lvl w:ilvl="6">
       <w:start w:val="1"/>
@@ -2820,6 +2875,7 @@
         </w:tabs>
         <w:ind w:start="2880" w:hanging="360"/>
       </w:pPr>
+      <w:rPr/>
     </w:lvl>
     <w:lvl w:ilvl="7">
       <w:start w:val="1"/>
@@ -2832,6 +2888,7 @@
         </w:tabs>
         <w:ind w:start="3240" w:hanging="360"/>
       </w:pPr>
+      <w:rPr/>
     </w:lvl>
     <w:lvl w:ilvl="8">
       <w:start w:val="1"/>
@@ -2844,6 +2901,7 @@
         </w:tabs>
         <w:ind w:start="3600" w:hanging="360"/>
       </w:pPr>
+      <w:rPr/>
     </w:lvl>
   </w:abstractNum>
   <w:abstractNum w:abstractNumId="6">
@@ -2871,6 +2929,7 @@
         </w:tabs>
         <w:ind w:start="1080" w:hanging="360"/>
       </w:pPr>
+      <w:rPr/>
     </w:lvl>
     <w:lvl w:ilvl="2">
       <w:start w:val="1"/>
@@ -2883,6 +2942,7 @@
         </w:tabs>
         <w:ind w:start="1440" w:hanging="360"/>
       </w:pPr>
+      <w:rPr/>
     </w:lvl>
     <w:lvl w:ilvl="3">
       <w:start w:val="1"/>
@@ -2895,6 +2955,7 @@
         </w:tabs>
         <w:ind w:start="1800" w:hanging="360"/>
       </w:pPr>
+      <w:rPr/>
     </w:lvl>
     <w:lvl w:ilvl="4">
       <w:start w:val="1"/>
@@ -2907,6 +2968,7 @@
         </w:tabs>
         <w:ind w:start="2160" w:hanging="360"/>
       </w:pPr>
+      <w:rPr/>
     </w:lvl>
     <w:lvl w:ilvl="5">
       <w:start w:val="1"/>
@@ -2919,6 +2981,7 @@
         </w:tabs>
         <w:ind w:start="2520" w:hanging="360"/>
       </w:pPr>
+      <w:rPr/>
     </w:lvl>
     <w:lvl w:ilvl="6">
       <w:start w:val="1"/>
@@ -2931,6 +2994,7 @@
         </w:tabs>
         <w:ind w:start="2880" w:hanging="360"/>
       </w:pPr>
+      <w:rPr/>
     </w:lvl>
     <w:lvl w:ilvl="7">
       <w:start w:val="1"/>
@@ -2943,6 +3007,7 @@
         </w:tabs>
         <w:ind w:start="3240" w:hanging="360"/>
       </w:pPr>
+      <w:rPr/>
     </w:lvl>
     <w:lvl w:ilvl="8">
       <w:start w:val="1"/>
@@ -2955,6 +3020,7 @@
         </w:tabs>
         <w:ind w:start="3600" w:hanging="360"/>
       </w:pPr>
+      <w:rPr/>
     </w:lvl>
   </w:abstractNum>
   <w:abstractNum w:abstractNumId="7">
@@ -3105,7 +3171,7 @@
   <w:docDefaults>
     <w:rPrDefault>
       <w:rPr>
-        <w:rFonts w:ascii="Cambria" w:hAnsi="Cambria" w:eastAsia="ＭＳ 明朝" w:cs="" w:asciiTheme="minorHAnsi" w:cstheme="minorBidi" w:eastAsiaTheme="minorEastAsia" w:hAnsiTheme="minorHAnsi"/>
+        <w:rFonts w:ascii="Cambria" w:hAnsi="Cambria" w:eastAsia="" w:cs="" w:asciiTheme="minorHAnsi" w:cstheme="minorBidi" w:eastAsiaTheme="minorEastAsia" w:hAnsiTheme="minorHAnsi"/>
         <w:sz w:val="22"/>
         <w:szCs w:val="22"/>
         <w:lang w:val="en-US" w:eastAsia="en-US" w:bidi="ar-SA"/>
@@ -3262,12 +3328,13 @@
     <w:rsid w:val="00fc693f"/>
     <w:pPr>
       <w:widowControl/>
+      <w:suppressAutoHyphens w:val="true"/>
       <w:bidi w:val="0"/>
       <w:spacing w:lineRule="auto" w:line="276" w:before="0" w:after="200"/>
       <w:jc w:val="start"/>
     </w:pPr>
     <w:rPr>
-      <w:rFonts w:ascii="Calibri" w:hAnsi="Calibri" w:eastAsia="ＭＳ 明朝" w:cs="" w:cstheme="minorBidi" w:eastAsiaTheme="minorEastAsia"/>
+      <w:rFonts w:ascii="Calibri" w:hAnsi="Calibri" w:eastAsia="" w:cs="" w:cstheme="minorBidi" w:eastAsiaTheme="minorEastAsia"/>
       <w:color w:val="auto"/>
       <w:kern w:val="0"/>
       <w:sz w:val="20"/>
@@ -3290,7 +3357,7 @@
       <w:outlineLvl w:val="0"/>
     </w:pPr>
     <w:rPr>
-      <w:rFonts w:ascii="Calibri" w:hAnsi="Calibri" w:eastAsia="ＭＳ ゴシック" w:cs="" w:asciiTheme="majorHAnsi" w:cstheme="majorBidi" w:eastAsiaTheme="majorEastAsia" w:hAnsiTheme="majorHAnsi"/>
+      <w:rFonts w:ascii="Calibri" w:hAnsi="Calibri" w:eastAsia="" w:cs="" w:asciiTheme="majorHAnsi" w:cstheme="majorBidi" w:eastAsiaTheme="majorEastAsia" w:hAnsiTheme="majorHAnsi"/>
       <w:b/>
       <w:bCs/>
       <w:color w:themeColor="accent1" w:themeShade="bf" w:val="365F91"/>
@@ -3314,7 +3381,7 @@
       <w:outlineLvl w:val="1"/>
     </w:pPr>
     <w:rPr>
-      <w:rFonts w:ascii="Calibri" w:hAnsi="Calibri" w:eastAsia="ＭＳ ゴシック" w:cs="" w:asciiTheme="majorHAnsi" w:cstheme="majorBidi" w:eastAsiaTheme="majorEastAsia" w:hAnsiTheme="majorHAnsi"/>
+      <w:rFonts w:ascii="Calibri" w:hAnsi="Calibri" w:eastAsia="" w:cs="" w:asciiTheme="majorHAnsi" w:cstheme="majorBidi" w:eastAsiaTheme="majorEastAsia" w:hAnsiTheme="majorHAnsi"/>
       <w:b/>
       <w:bCs/>
       <w:color w:themeColor="accent1" w:val="4F81BD"/>
@@ -3338,7 +3405,7 @@
       <w:outlineLvl w:val="2"/>
     </w:pPr>
     <w:rPr>
-      <w:rFonts w:ascii="Calibri" w:hAnsi="Calibri" w:eastAsia="ＭＳ ゴシック" w:cs="" w:asciiTheme="majorHAnsi" w:cstheme="majorBidi" w:eastAsiaTheme="majorEastAsia" w:hAnsiTheme="majorHAnsi"/>
+      <w:rFonts w:ascii="Calibri" w:hAnsi="Calibri" w:eastAsia="" w:cs="" w:asciiTheme="majorHAnsi" w:cstheme="majorBidi" w:eastAsiaTheme="majorEastAsia" w:hAnsiTheme="majorHAnsi"/>
       <w:b/>
       <w:bCs/>
       <w:color w:themeColor="accent1" w:val="4F81BD"/>
@@ -3361,7 +3428,7 @@
       <w:outlineLvl w:val="3"/>
     </w:pPr>
     <w:rPr>
-      <w:rFonts w:ascii="Calibri" w:hAnsi="Calibri" w:eastAsia="ＭＳ ゴシック" w:cs="" w:asciiTheme="majorHAnsi" w:cstheme="majorBidi" w:eastAsiaTheme="majorEastAsia" w:hAnsiTheme="majorHAnsi"/>
+      <w:rFonts w:ascii="Calibri" w:hAnsi="Calibri" w:eastAsia="" w:cs="" w:asciiTheme="majorHAnsi" w:cstheme="majorBidi" w:eastAsiaTheme="majorEastAsia" w:hAnsiTheme="majorHAnsi"/>
       <w:b/>
       <w:bCs/>
       <w:i/>
@@ -3386,7 +3453,7 @@
       <w:outlineLvl w:val="4"/>
     </w:pPr>
     <w:rPr>
-      <w:rFonts w:ascii="Calibri" w:hAnsi="Calibri" w:eastAsia="ＭＳ ゴシック" w:cs="" w:asciiTheme="majorHAnsi" w:cstheme="majorBidi" w:eastAsiaTheme="majorEastAsia" w:hAnsiTheme="majorHAnsi"/>
+      <w:rFonts w:ascii="Calibri" w:hAnsi="Calibri" w:eastAsia="" w:cs="" w:asciiTheme="majorHAnsi" w:cstheme="majorBidi" w:eastAsiaTheme="majorEastAsia" w:hAnsiTheme="majorHAnsi"/>
       <w:color w:themeColor="accent1" w:themeShade="7f" w:val="243F60"/>
     </w:rPr>
   </w:style>
@@ -3407,7 +3474,7 @@
       <w:outlineLvl w:val="5"/>
     </w:pPr>
     <w:rPr>
-      <w:rFonts w:ascii="Calibri" w:hAnsi="Calibri" w:eastAsia="ＭＳ ゴシック" w:cs="" w:asciiTheme="majorHAnsi" w:cstheme="majorBidi" w:eastAsiaTheme="majorEastAsia" w:hAnsiTheme="majorHAnsi"/>
+      <w:rFonts w:ascii="Calibri" w:hAnsi="Calibri" w:eastAsia="" w:cs="" w:asciiTheme="majorHAnsi" w:cstheme="majorBidi" w:eastAsiaTheme="majorEastAsia" w:hAnsiTheme="majorHAnsi"/>
       <w:i/>
       <w:iCs/>
       <w:color w:themeColor="accent1" w:themeShade="7f" w:val="243F60"/>
@@ -3430,7 +3497,7 @@
       <w:outlineLvl w:val="6"/>
     </w:pPr>
     <w:rPr>
-      <w:rFonts w:ascii="Calibri" w:hAnsi="Calibri" w:eastAsia="ＭＳ ゴシック" w:cs="" w:asciiTheme="majorHAnsi" w:cstheme="majorBidi" w:eastAsiaTheme="majorEastAsia" w:hAnsiTheme="majorHAnsi"/>
+      <w:rFonts w:ascii="Calibri" w:hAnsi="Calibri" w:eastAsia="" w:cs="" w:asciiTheme="majorHAnsi" w:cstheme="majorBidi" w:eastAsiaTheme="majorEastAsia" w:hAnsiTheme="majorHAnsi"/>
       <w:i/>
       <w:iCs/>
       <w:color w:themeColor="text1" w:themeTint="bf" w:val="404040"/>
@@ -3453,7 +3520,7 @@
       <w:outlineLvl w:val="7"/>
     </w:pPr>
     <w:rPr>
-      <w:rFonts w:ascii="Calibri" w:hAnsi="Calibri" w:eastAsia="ＭＳ ゴシック" w:cs="" w:asciiTheme="majorHAnsi" w:cstheme="majorBidi" w:eastAsiaTheme="majorEastAsia" w:hAnsiTheme="majorHAnsi"/>
+      <w:rFonts w:ascii="Calibri" w:hAnsi="Calibri" w:eastAsia="" w:cs="" w:asciiTheme="majorHAnsi" w:cstheme="majorBidi" w:eastAsiaTheme="majorEastAsia" w:hAnsiTheme="majorHAnsi"/>
       <w:color w:themeColor="accent1" w:val="4F81BD"/>
       <w:sz w:val="20"/>
       <w:szCs w:val="20"/>
@@ -3476,7 +3543,7 @@
       <w:outlineLvl w:val="8"/>
     </w:pPr>
     <w:rPr>
-      <w:rFonts w:ascii="Calibri" w:hAnsi="Calibri" w:eastAsia="ＭＳ ゴシック" w:cs="" w:asciiTheme="majorHAnsi" w:cstheme="majorBidi" w:eastAsiaTheme="majorEastAsia" w:hAnsiTheme="majorHAnsi"/>
+      <w:rFonts w:ascii="Calibri" w:hAnsi="Calibri" w:eastAsia="" w:cs="" w:asciiTheme="majorHAnsi" w:cstheme="majorBidi" w:eastAsiaTheme="majorEastAsia" w:hAnsiTheme="majorHAnsi"/>
       <w:i/>
       <w:iCs/>
       <w:color w:themeColor="text1" w:themeTint="bf" w:val="404040"/>
@@ -3518,7 +3585,7 @@
     <w:qFormat/>
     <w:rsid w:val="00fc693f"/>
     <w:rPr>
-      <w:rFonts w:ascii="Calibri" w:hAnsi="Calibri" w:eastAsia="ＭＳ ゴシック" w:cs="" w:asciiTheme="majorHAnsi" w:cstheme="majorBidi" w:eastAsiaTheme="majorEastAsia" w:hAnsiTheme="majorHAnsi"/>
+      <w:rFonts w:ascii="Calibri" w:hAnsi="Calibri" w:eastAsia="" w:cs="" w:asciiTheme="majorHAnsi" w:cstheme="majorBidi" w:eastAsiaTheme="majorEastAsia" w:hAnsiTheme="majorHAnsi"/>
       <w:b/>
       <w:bCs/>
       <w:color w:themeColor="accent1" w:themeShade="bf" w:val="365F91"/>
@@ -3534,7 +3601,7 @@
     <w:qFormat/>
     <w:rsid w:val="00fc693f"/>
     <w:rPr>
-      <w:rFonts w:ascii="Calibri" w:hAnsi="Calibri" w:eastAsia="ＭＳ ゴシック" w:cs="" w:asciiTheme="majorHAnsi" w:cstheme="majorBidi" w:eastAsiaTheme="majorEastAsia" w:hAnsiTheme="majorHAnsi"/>
+      <w:rFonts w:ascii="Calibri" w:hAnsi="Calibri" w:eastAsia="" w:cs="" w:asciiTheme="majorHAnsi" w:cstheme="majorBidi" w:eastAsiaTheme="majorEastAsia" w:hAnsiTheme="majorHAnsi"/>
       <w:b/>
       <w:bCs/>
       <w:color w:themeColor="accent1" w:val="4F81BD"/>
@@ -3550,7 +3617,7 @@
     <w:qFormat/>
     <w:rsid w:val="00fc693f"/>
     <w:rPr>
-      <w:rFonts w:ascii="Calibri" w:hAnsi="Calibri" w:eastAsia="ＭＳ ゴシック" w:cs="" w:asciiTheme="majorHAnsi" w:cstheme="majorBidi" w:eastAsiaTheme="majorEastAsia" w:hAnsiTheme="majorHAnsi"/>
+      <w:rFonts w:ascii="Calibri" w:hAnsi="Calibri" w:eastAsia="" w:cs="" w:asciiTheme="majorHAnsi" w:cstheme="majorBidi" w:eastAsiaTheme="majorEastAsia" w:hAnsiTheme="majorHAnsi"/>
       <w:b/>
       <w:bCs/>
       <w:color w:themeColor="accent1" w:val="4F81BD"/>
@@ -3564,7 +3631,7 @@
     <w:qFormat/>
     <w:rsid w:val="00fc693f"/>
     <w:rPr>
-      <w:rFonts w:ascii="Calibri" w:hAnsi="Calibri" w:eastAsia="ＭＳ ゴシック" w:cs="" w:asciiTheme="majorHAnsi" w:cstheme="majorBidi" w:eastAsiaTheme="majorEastAsia" w:hAnsiTheme="majorHAnsi"/>
+      <w:rFonts w:ascii="Calibri" w:hAnsi="Calibri" w:eastAsia="" w:cs="" w:asciiTheme="majorHAnsi" w:cstheme="majorBidi" w:eastAsiaTheme="majorEastAsia" w:hAnsiTheme="majorHAnsi"/>
       <w:color w:themeColor="text2" w:themeShade="bf" w:val="17365D"/>
       <w:spacing w:val="5"/>
       <w:kern w:val="2"/>
@@ -3580,7 +3647,7 @@
     <w:qFormat/>
     <w:rsid w:val="00fc693f"/>
     <w:rPr>
-      <w:rFonts w:ascii="Calibri" w:hAnsi="Calibri" w:eastAsia="ＭＳ ゴシック" w:cs="" w:asciiTheme="majorHAnsi" w:cstheme="majorBidi" w:eastAsiaTheme="majorEastAsia" w:hAnsiTheme="majorHAnsi"/>
+      <w:rFonts w:ascii="Calibri" w:hAnsi="Calibri" w:eastAsia="" w:cs="" w:asciiTheme="majorHAnsi" w:cstheme="majorBidi" w:eastAsiaTheme="majorEastAsia" w:hAnsiTheme="majorHAnsi"/>
       <w:i/>
       <w:iCs/>
       <w:color w:themeColor="accent1" w:val="4F81BD"/>
@@ -3653,7 +3720,7 @@
     <w:qFormat/>
     <w:rsid w:val="00fc693f"/>
     <w:rPr>
-      <w:rFonts w:ascii="Calibri" w:hAnsi="Calibri" w:eastAsia="ＭＳ ゴシック" w:cs="" w:asciiTheme="majorHAnsi" w:cstheme="majorBidi" w:eastAsiaTheme="majorEastAsia" w:hAnsiTheme="majorHAnsi"/>
+      <w:rFonts w:ascii="Calibri" w:hAnsi="Calibri" w:eastAsia="" w:cs="" w:asciiTheme="majorHAnsi" w:cstheme="majorBidi" w:eastAsiaTheme="majorEastAsia" w:hAnsiTheme="majorHAnsi"/>
       <w:b/>
       <w:bCs/>
       <w:i/>
@@ -3670,7 +3737,7 @@
     <w:qFormat/>
     <w:rsid w:val="00fc693f"/>
     <w:rPr>
-      <w:rFonts w:ascii="Calibri" w:hAnsi="Calibri" w:eastAsia="ＭＳ ゴシック" w:cs="" w:asciiTheme="majorHAnsi" w:cstheme="majorBidi" w:eastAsiaTheme="majorEastAsia" w:hAnsiTheme="majorHAnsi"/>
+      <w:rFonts w:ascii="Calibri" w:hAnsi="Calibri" w:eastAsia="" w:cs="" w:asciiTheme="majorHAnsi" w:cstheme="majorBidi" w:eastAsiaTheme="majorEastAsia" w:hAnsiTheme="majorHAnsi"/>
       <w:color w:themeColor="accent1" w:themeShade="7f" w:val="243F60"/>
     </w:rPr>
   </w:style>
@@ -3683,7 +3750,7 @@
     <w:qFormat/>
     <w:rsid w:val="00fc693f"/>
     <w:rPr>
-      <w:rFonts w:ascii="Calibri" w:hAnsi="Calibri" w:eastAsia="ＭＳ ゴシック" w:cs="" w:asciiTheme="majorHAnsi" w:cstheme="majorBidi" w:eastAsiaTheme="majorEastAsia" w:hAnsiTheme="majorHAnsi"/>
+      <w:rFonts w:ascii="Calibri" w:hAnsi="Calibri" w:eastAsia="" w:cs="" w:asciiTheme="majorHAnsi" w:cstheme="majorBidi" w:eastAsiaTheme="majorEastAsia" w:hAnsiTheme="majorHAnsi"/>
       <w:i/>
       <w:iCs/>
       <w:color w:themeColor="accent1" w:themeShade="7f" w:val="243F60"/>
@@ -3698,7 +3765,7 @@
     <w:qFormat/>
     <w:rsid w:val="00fc693f"/>
     <w:rPr>
-      <w:rFonts w:ascii="Calibri" w:hAnsi="Calibri" w:eastAsia="ＭＳ ゴシック" w:cs="" w:asciiTheme="majorHAnsi" w:cstheme="majorBidi" w:eastAsiaTheme="majorEastAsia" w:hAnsiTheme="majorHAnsi"/>
+      <w:rFonts w:ascii="Calibri" w:hAnsi="Calibri" w:eastAsia="" w:cs="" w:asciiTheme="majorHAnsi" w:cstheme="majorBidi" w:eastAsiaTheme="majorEastAsia" w:hAnsiTheme="majorHAnsi"/>
       <w:i/>
       <w:iCs/>
       <w:color w:themeColor="text1" w:themeTint="bf" w:val="404040"/>
@@ -3713,7 +3780,7 @@
     <w:qFormat/>
     <w:rsid w:val="00fc693f"/>
     <w:rPr>
-      <w:rFonts w:ascii="Calibri" w:hAnsi="Calibri" w:eastAsia="ＭＳ ゴシック" w:cs="" w:asciiTheme="majorHAnsi" w:cstheme="majorBidi" w:eastAsiaTheme="majorEastAsia" w:hAnsiTheme="majorHAnsi"/>
+      <w:rFonts w:ascii="Calibri" w:hAnsi="Calibri" w:eastAsia="" w:cs="" w:asciiTheme="majorHAnsi" w:cstheme="majorBidi" w:eastAsiaTheme="majorEastAsia" w:hAnsiTheme="majorHAnsi"/>
       <w:color w:themeColor="accent1" w:val="4F81BD"/>
       <w:sz w:val="20"/>
       <w:szCs w:val="20"/>
@@ -3728,7 +3795,7 @@
     <w:qFormat/>
     <w:rsid w:val="00fc693f"/>
     <w:rPr>
-      <w:rFonts w:ascii="Calibri" w:hAnsi="Calibri" w:eastAsia="ＭＳ ゴシック" w:cs="" w:asciiTheme="majorHAnsi" w:cstheme="majorBidi" w:eastAsiaTheme="majorEastAsia" w:hAnsiTheme="majorHAnsi"/>
+      <w:rFonts w:ascii="Calibri" w:hAnsi="Calibri" w:eastAsia="" w:cs="" w:asciiTheme="majorHAnsi" w:cstheme="majorBidi" w:eastAsiaTheme="majorEastAsia" w:hAnsiTheme="majorHAnsi"/>
       <w:i/>
       <w:iCs/>
       <w:color w:themeColor="text1" w:themeTint="bf" w:val="404040"/>
@@ -3958,12 +4025,13 @@
     <w:rsid w:val="00fc693f"/>
     <w:pPr>
       <w:widowControl/>
+      <w:suppressAutoHyphens w:val="true"/>
       <w:bidi w:val="0"/>
       <w:spacing w:lineRule="auto" w:line="240" w:before="0" w:after="0"/>
       <w:jc w:val="start"/>
     </w:pPr>
     <w:rPr>
-      <w:rFonts w:ascii="Cambria" w:hAnsi="Cambria" w:eastAsia="ＭＳ 明朝" w:cs="" w:asciiTheme="minorHAnsi" w:cstheme="minorBidi" w:eastAsiaTheme="minorEastAsia" w:hAnsiTheme="minorHAnsi"/>
+      <w:rFonts w:ascii="Cambria" w:hAnsi="Cambria" w:eastAsia="" w:cs="" w:asciiTheme="minorHAnsi" w:cstheme="minorBidi" w:eastAsiaTheme="minorEastAsia" w:hAnsiTheme="minorHAnsi"/>
       <w:color w:val="auto"/>
       <w:kern w:val="0"/>
       <w:sz w:val="22"/>
@@ -3987,7 +4055,7 @@
       <w:contextualSpacing/>
     </w:pPr>
     <w:rPr>
-      <w:rFonts w:ascii="Calibri" w:hAnsi="Calibri" w:eastAsia="ＭＳ ゴシック" w:cs="" w:asciiTheme="majorHAnsi" w:cstheme="majorBidi" w:eastAsiaTheme="majorEastAsia" w:hAnsiTheme="majorHAnsi"/>
+      <w:rFonts w:ascii="Calibri" w:hAnsi="Calibri" w:eastAsia="" w:cs="" w:asciiTheme="majorHAnsi" w:cstheme="majorBidi" w:eastAsiaTheme="majorEastAsia" w:hAnsiTheme="majorHAnsi"/>
       <w:color w:themeColor="text2" w:themeShade="bf" w:val="17365D"/>
       <w:spacing w:val="5"/>
       <w:kern w:val="2"/>
@@ -4005,7 +4073,7 @@
     <w:rsid w:val="00fc693f"/>
     <w:pPr/>
     <w:rPr>
-      <w:rFonts w:ascii="Calibri" w:hAnsi="Calibri" w:eastAsia="ＭＳ ゴシック" w:cs="" w:asciiTheme="majorHAnsi" w:cstheme="majorBidi" w:eastAsiaTheme="majorEastAsia" w:hAnsiTheme="majorHAnsi"/>
+      <w:rFonts w:ascii="Calibri" w:hAnsi="Calibri" w:eastAsia="" w:cs="" w:asciiTheme="majorHAnsi" w:cstheme="majorBidi" w:eastAsiaTheme="majorEastAsia" w:hAnsiTheme="majorHAnsi"/>
       <w:i/>
       <w:iCs/>
       <w:color w:themeColor="accent1" w:val="4F81BD"/>
@@ -4238,12 +4306,13 @@
         <w:tab w:val="left" w:pos="3456" w:leader="none"/>
         <w:tab w:val="left" w:pos="4032" w:leader="none"/>
       </w:tabs>
+      <w:suppressAutoHyphens w:val="true"/>
       <w:bidi w:val="0"/>
       <w:spacing w:lineRule="auto" w:line="276" w:before="0" w:after="200"/>
       <w:jc w:val="start"/>
     </w:pPr>
     <w:rPr>
-      <w:rFonts w:ascii="Courier" w:hAnsi="Courier" w:eastAsia="ＭＳ 明朝" w:cs="" w:cstheme="minorBidi" w:eastAsiaTheme="minorEastAsia"/>
+      <w:rFonts w:ascii="Courier" w:hAnsi="Courier" w:eastAsia="" w:cs="" w:cstheme="minorBidi" w:eastAsiaTheme="minorEastAsia"/>
       <w:color w:val="auto"/>
       <w:kern w:val="0"/>
       <w:sz w:val="20"/>
@@ -7441,7 +7510,6 @@
       <w:pPr>
         <w:spacing w:before="0" w:after="0" w:line="240" w:lineRule="auto"/>
       </w:pPr>
-      <w:rPr/>
       <w:tblPr/>
       <w:tcPr>
         <w:tcBorders>
@@ -7587,7 +7655,6 @@
       <w:pPr>
         <w:spacing w:before="0" w:after="0" w:line="240" w:lineRule="auto"/>
       </w:pPr>
-      <w:rPr/>
       <w:tblPr/>
       <w:tcPr>
         <w:tcBorders>
@@ -7733,7 +7800,6 @@
       <w:pPr>
         <w:spacing w:before="0" w:after="0" w:line="240" w:lineRule="auto"/>
       </w:pPr>
-      <w:rPr/>
       <w:tblPr/>
       <w:tcPr>
         <w:tcBorders>
@@ -7879,7 +7945,6 @@
       <w:pPr>
         <w:spacing w:before="0" w:after="0" w:line="240" w:lineRule="auto"/>
       </w:pPr>
-      <w:rPr/>
       <w:tblPr/>
       <w:tcPr>
         <w:tcBorders>
@@ -8025,7 +8090,6 @@
       <w:pPr>
         <w:spacing w:before="0" w:after="0" w:line="240" w:lineRule="auto"/>
       </w:pPr>
-      <w:rPr/>
       <w:tblPr/>
       <w:tcPr>
         <w:tcBorders>
@@ -8171,7 +8235,6 @@
       <w:pPr>
         <w:spacing w:before="0" w:after="0" w:line="240" w:lineRule="auto"/>
       </w:pPr>
-      <w:rPr/>
       <w:tblPr/>
       <w:tcPr>
         <w:tcBorders>
@@ -8317,7 +8380,6 @@
       <w:pPr>
         <w:spacing w:before="0" w:after="0" w:line="240" w:lineRule="auto"/>
       </w:pPr>
-      <w:rPr/>
       <w:tblPr/>
       <w:tcPr>
         <w:tcBorders>

</xml_diff>